<commit_message>
English font size changed to 10.
</commit_message>
<xml_diff>
--- a/سواد_برخالی_نسخه_نهایی.docx
+++ b/سواد_برخالی_نسخه_نهایی.docx
@@ -2325,11 +2325,23 @@
           <w:rtl/>
           <w:lang w:bidi="fa-IR"/>
         </w:rPr>
-        <w:t xml:space="preserve"> (</w:t>
-      </w:r>
-      <w:r>
-        <w:rPr>
-          <w:rFonts w:cs="2  Nazanin"/>
+        <w:t xml:space="preserve"> </w:t>
+      </w:r>
+      <w:r>
+        <w:rPr>
+          <w:rFonts w:cs="2  Nazanin"/>
+          <w:sz w:val="20"/>
+          <w:szCs w:val="20"/>
+          <w:rtl/>
+          <w:lang w:bidi="fa-IR"/>
+        </w:rPr>
+        <w:t>(</w:t>
+      </w:r>
+      <w:r>
+        <w:rPr>
+          <w:rFonts w:cs="2  Nazanin"/>
+          <w:sz w:val="20"/>
+          <w:szCs w:val="20"/>
           <w:lang w:bidi="fa-IR"/>
         </w:rPr>
         <w:t>Fractal</w:t>
@@ -2337,6 +2349,8 @@
       <w:r>
         <w:rPr>
           <w:rFonts w:cs="2  Nazanin"/>
+          <w:sz w:val="20"/>
+          <w:szCs w:val="20"/>
           <w:rtl/>
           <w:lang w:bidi="fa-IR"/>
         </w:rPr>
@@ -2396,21 +2410,21 @@
           <w:rFonts w:cs="2  Nazanin" w:hint="cs"/>
           <w:rtl/>
         </w:rPr>
+        <w:t>پنهان</w:t>
+      </w:r>
+      <w:r>
+        <w:rPr>
+          <w:rFonts w:cs="2  Nazanin"/>
+          <w:rtl/>
+        </w:rPr>
+        <w:t xml:space="preserve"> </w:t>
+      </w:r>
+      <w:r>
+        <w:rPr>
+          <w:rFonts w:cs="2  Nazanin" w:hint="cs"/>
+          <w:rtl/>
+        </w:rPr>
         <w:lastRenderedPageBreak/>
-        <w:t>پنهان</w:t>
-      </w:r>
-      <w:r>
-        <w:rPr>
-          <w:rFonts w:cs="2  Nazanin"/>
-          <w:rtl/>
-        </w:rPr>
-        <w:t xml:space="preserve"> </w:t>
-      </w:r>
-      <w:r>
-        <w:rPr>
-          <w:rFonts w:cs="2  Nazanin" w:hint="cs"/>
-          <w:rtl/>
-        </w:rPr>
         <w:t>در</w:t>
       </w:r>
       <w:r>
@@ -3029,11 +3043,23 @@
           <w:rtl/>
           <w:lang w:bidi="fa-IR"/>
         </w:rPr>
-        <w:t>» (</w:t>
-      </w:r>
-      <w:r>
-        <w:rPr>
-          <w:rFonts w:cs="2  Nazanin"/>
+        <w:t xml:space="preserve">» </w:t>
+      </w:r>
+      <w:r>
+        <w:rPr>
+          <w:rFonts w:cs="2  Nazanin"/>
+          <w:sz w:val="20"/>
+          <w:szCs w:val="20"/>
+          <w:rtl/>
+          <w:lang w:bidi="fa-IR"/>
+        </w:rPr>
+        <w:t>(</w:t>
+      </w:r>
+      <w:r>
+        <w:rPr>
+          <w:rFonts w:cs="2  Nazanin"/>
+          <w:sz w:val="20"/>
+          <w:szCs w:val="20"/>
           <w:lang w:bidi="fa-IR"/>
         </w:rPr>
         <w:t>Jascha Sohl-Dickstein</w:t>
@@ -3041,10 +3067,20 @@
       <w:r>
         <w:rPr>
           <w:rFonts w:cs="2  Nazanin"/>
-          <w:rtl/>
-          <w:lang w:bidi="fa-IR"/>
-        </w:rPr>
-        <w:t xml:space="preserve">) </w:t>
+          <w:sz w:val="20"/>
+          <w:szCs w:val="20"/>
+          <w:rtl/>
+          <w:lang w:bidi="fa-IR"/>
+        </w:rPr>
+        <w:t>)</w:t>
+      </w:r>
+      <w:r>
+        <w:rPr>
+          <w:rFonts w:cs="2  Nazanin"/>
+          <w:rtl/>
+          <w:lang w:bidi="fa-IR"/>
+        </w:rPr>
+        <w:t xml:space="preserve"> </w:t>
       </w:r>
       <w:r>
         <w:rPr>
@@ -3058,6 +3094,8 @@
           <w:rFonts w:cs="2  Nazanin"/>
           <w:i/>
           <w:iCs/>
+          <w:sz w:val="20"/>
+          <w:szCs w:val="20"/>
           <w:lang w:bidi="fa-IR"/>
         </w:rPr>
         <w:t>Neural Network Training Makes Beautiful Fractals</w:t>
@@ -3082,17 +3120,42 @@
           <w:rFonts w:cs="2  Nazanin"/>
           <w:i/>
           <w:iCs/>
-          <w:lang w:bidi="fa-IR"/>
-        </w:rPr>
-        <w:t>arXiv:2402.06184</w:t>
-      </w:r>
-      <w:r>
-        <w:rPr>
-          <w:rFonts w:cs="2  Nazanin"/>
-          <w:rtl/>
-          <w:lang w:bidi="fa-IR"/>
-        </w:rPr>
-        <w:t xml:space="preserve">) </w:t>
+          <w:sz w:val="20"/>
+          <w:szCs w:val="20"/>
+          <w:lang w:bidi="fa-IR"/>
+        </w:rPr>
+        <w:t>arXiv:2402.0618</w:t>
+      </w:r>
+      <w:r>
+        <w:rPr>
+          <w:rFonts w:cs="2  Nazanin"/>
+          <w:i/>
+          <w:iCs/>
+          <w:sz w:val="20"/>
+          <w:szCs w:val="20"/>
+          <w:lang w:bidi="fa-IR"/>
+        </w:rPr>
+        <w:t>4)</w:t>
+      </w:r>
+      <w:r>
+        <w:rPr>
+          <w:rFonts w:cs="2  Nazanin"/>
+          <w:i/>
+          <w:iCs/>
+          <w:sz w:val="20"/>
+          <w:szCs w:val="20"/>
+          <w:rtl/>
+          <w:lang w:bidi="fa-IR"/>
+        </w:rPr>
+        <w:t>)</w:t>
+      </w:r>
+      <w:r>
+        <w:rPr>
+          <w:rFonts w:cs="2  Nazanin"/>
+          <w:rtl/>
+          <w:lang w:bidi="fa-IR"/>
+        </w:rPr>
+        <w:t xml:space="preserve"> </w:t>
       </w:r>
       <w:r>
         <w:rPr>
@@ -3104,6 +3167,8 @@
       <w:r>
         <w:rPr>
           <w:rFonts w:cs="2  Nazanin"/>
+          <w:sz w:val="20"/>
+          <w:szCs w:val="20"/>
           <w:rtl/>
           <w:lang w:bidi="fa-IR"/>
         </w:rPr>
@@ -3112,6 +3177,8 @@
       <w:r>
         <w:rPr>
           <w:rFonts w:cs="2  Nazanin"/>
+          <w:sz w:val="20"/>
+          <w:szCs w:val="20"/>
           <w:lang w:bidi="fa-IR"/>
         </w:rPr>
         <w:t>Hyperparameter Space</w:t>
@@ -3119,10 +3186,20 @@
       <w:r>
         <w:rPr>
           <w:rFonts w:cs="2  Nazanin"/>
-          <w:rtl/>
-          <w:lang w:bidi="fa-IR"/>
-        </w:rPr>
-        <w:t xml:space="preserve">) </w:t>
+          <w:sz w:val="20"/>
+          <w:szCs w:val="20"/>
+          <w:rtl/>
+          <w:lang w:bidi="fa-IR"/>
+        </w:rPr>
+        <w:t>)</w:t>
+      </w:r>
+      <w:r>
+        <w:rPr>
+          <w:rFonts w:cs="2  Nazanin"/>
+          <w:rtl/>
+          <w:lang w:bidi="fa-IR"/>
+        </w:rPr>
+        <w:t xml:space="preserve"> </w:t>
       </w:r>
       <w:r>
         <w:rPr>
@@ -3784,10 +3861,10 @@
       </w:r>
       <w:r>
         <w:rPr>
-          <w:rFonts w:ascii="Arial" w:hAnsi="Arial" w:cs="Arial" w:hint="cs"/>
-          <w:rtl/>
-        </w:rPr>
-        <w:t>—</w:t>
+          <w:rFonts w:cs="2  Nazanin" w:hint="cs"/>
+          <w:rtl/>
+        </w:rPr>
+        <w:t>-</w:t>
       </w:r>
       <w:r>
         <w:rPr>
@@ -4519,6 +4596,8 @@
           <w:rFonts w:cs="2  Nazanin"/>
           <w:i/>
           <w:iCs/>
+          <w:sz w:val="20"/>
+          <w:szCs w:val="20"/>
           <w:lang w:bidi="fa-IR"/>
         </w:rPr>
         <w:t>Fractal Structure of Human and Primate Social Networks Optimizes Information Flow</w:t>
@@ -4536,7 +4615,7 @@
           <w:rFonts w:cs="2  Nazanin"/>
           <w:rtl/>
         </w:rPr>
-        <w:t>(«ساختار فرکتالی شبکه‌های اجتماعی انسان و نخستی‌سانان جریان اطلاعات را بهینه می‌کند»)، بروس وست و همکارانش (</w:t>
+        <w:t>«ساختار فرکتالی شبکه‌های اجتماعی انسان و نخستی‌سانان جریان اطلاعات را بهینه می‌کند»، بروس وست و همکارانش (</w:t>
       </w:r>
       <w:r>
         <w:rPr>
@@ -8733,55 +8812,18 @@
     </w:p>
     <w:p>
       <w:pPr>
-        <w:bidi/>
         <w:spacing w:after="0" w:line="240" w:lineRule="auto"/>
-        <w:jc w:val="right"/>
-        <w:rPr>
-          <w:rFonts w:cs="2  Nazanin"/>
-          <w:lang w:bidi="fa-IR"/>
-        </w:rPr>
+        <w:ind w:left="357" w:hanging="357"/>
       </w:pPr>
       <w:r>
-        <w:rPr>
-          <w:rFonts w:cs="2  Nazanin"/>
-          <w:rtl/>
-          <w:lang w:bidi="fa-IR"/>
-        </w:rPr>
-        <w:t>(</w:t>
-      </w:r>
-      <w:r>
-        <w:rPr>
-          <w:rFonts w:cs="2  Nazanin" w:hint="cs"/>
-          <w:rtl/>
-          <w:lang w:bidi="fa-IR"/>
-        </w:rPr>
-        <w:t>نسخه</w:t>
-      </w:r>
-      <w:r>
-        <w:rPr>
-          <w:rFonts w:cs="2  Nazanin"/>
-          <w:rtl/>
-          <w:lang w:bidi="fa-IR"/>
-        </w:rPr>
-        <w:t xml:space="preserve"> 1.0.1). </w:t>
+        <w:t xml:space="preserve">(Version 1.0.1). </w:t>
       </w:r>
       <w:proofErr w:type="spellStart"/>
       <w:r>
-        <w:rPr>
-          <w:rFonts w:cs="2  Nazanin"/>
-          <w:sz w:val="20"/>
-          <w:szCs w:val="20"/>
-          <w:lang w:bidi="fa-IR"/>
-        </w:rPr>
         <w:t>Zenodo</w:t>
       </w:r>
       <w:proofErr w:type="spellEnd"/>
       <w:r>
-        <w:rPr>
-          <w:rFonts w:cs="2  Nazanin"/>
-          <w:rtl/>
-          <w:lang w:bidi="fa-IR"/>
-        </w:rPr>
         <w:t>.</w:t>
       </w:r>
     </w:p>
@@ -9044,6 +9086,7 @@
         </w:r>
         <w:r>
           <w:rPr>
+            <w:rtl/>
             <w:lang w:bidi="fa-IR"/>
           </w:rPr>
           <w:fldChar w:fldCharType="separate"/>
@@ -9706,6 +9749,7 @@
   <w:style w:type="character" w:default="1" w:styleId="DefaultParagraphFont">
     <w:name w:val="Default Paragraph Font"/>
     <w:uiPriority w:val="1"/>
+    <w:semiHidden/>
     <w:unhideWhenUsed/>
   </w:style>
   <w:style w:type="table" w:default="1" w:styleId="TableNormal">

</xml_diff>